<commit_message>
docs: apply WO-E through WO-Q patches to ResearchOne_Final_Report.docx
Agent-Logs-Url: https://github.com/GooseyPrime/ResearchOne/sessions/8603b760-0fef-4004-a49a-d95755b2db9c

Co-authored-by: GooseyPrime <78740045+GooseyPrime@users.noreply.github.com>
</commit_message>
<xml_diff>
--- a/docs/ResearchOne_Final_Report.docx
+++ b/docs/ResearchOne_Final_Report.docx
@@ -55938,6 +55938,11 @@
       </w:r>
     </w:p>
     <w:p>
+      <w:r>
+        <w:t xml:space="preserve">Run scripts/stripe-bootstrap.ts as the canonical product/price spec. Replaces manual dashboard product creation. Idempotent via lookup_key. Outputs the STRIPE_PRICE_ID_* env block on success. The script creates: existing six tiers from the current spec (Student Monthly/Annual, Pro Monthly/Annual, Team Seat Monthly/Annual, BYOK Monthly, Wallet Top-up $20/$50/$100), plus seven new SKUs (Living Reports, Reverse-Citation Watch, Adversarial Twin, Provenance Ledger, PolicyOne Score API Pro, Patent IP Diligence floor, Sovereign Onboarding), and four Sovereign add-ons.</w:t>
+      </w:r>
+    </w:p>
+    <w:p>
       <w:pPr>
         <w:pStyle w:val="BodyText"/>
       </w:pPr>
@@ -56630,6 +56635,11 @@
       </w:r>
     </w:p>
     <w:p>
+      <w:r>
+        <w:t xml:space="preserve">Additional task — Extract shared webhook core: Files to create: backend/src/api/webhooks/_shared/verifyAndDispatch.ts — contains raw-body + signature-scheme + idempotency-key core logic. Files to modify: backend/src/api/webhooks/stripe.ts — refactor to a ~40-line consumer of verifyAndDispatch core. Acceptance criteria: a fake noop provider can be wired in tests in &lt;30 LOC. This is the template for WO-T's Parallel Monitor webhook. Tests required: wire a noop provider via verifyAndDispatch in a test file (&lt;30 LOC); verify the Stripe handler passes through correctly.</w:t>
+      </w:r>
+    </w:p>
+    <w:p>
       <w:pPr>
         <w:pStyle w:val="BodyText"/>
       </w:pPr>
@@ -56828,6 +56838,16 @@
       </w:r>
     </w:p>
     <w:p>
+      <w:r>
+        <w:t xml:space="preserve">TIER_RULES additions — add the following new per-tier boolean flags to each tier entry in backend/src/config/tierRules.ts: parallel_search, parallel_extract, smart_citations, living_reports_included, adversarial_twin_included, provenance_ledger_included. Default values: free_demo and wallet — all false; student and pro — parallel_search and smart_citations true, others false; team — parallel_search, parallel_extract, smart_citations, living_reports_included true; byok — same as team plus adversarial_twin_included true; sovereign — all true.</w:t>
+      </w:r>
+    </w:p>
+    <w:p>
+      <w:r>
+        <w:t xml:space="preserve">New DB table — add to migration 20260XXX_tier_tables.sql: CREATE TABLE tier_addons (id bigserial PRIMARY KEY, tier text NOT NULL, addon_key text NOT NULL, addon_price_cents integer NOT NULL CHECK (addon_price_cents &gt;= 0), included_count_per_period integer NOT NULL DEFAULT 0, UNIQUE (tier, addon_key)). Seed rows for each addon SKU and the tiers eligible to purchase them.</w:t>
+      </w:r>
+    </w:p>
+    <w:p>
       <w:pPr>
         <w:pStyle w:val="BodyText"/>
       </w:pPr>
@@ -57102,43 +57122,18 @@
         <w:pStyle w:val="BodyText"/>
       </w:pPr>
       <w:r>
+        <w:t>Files to create: backend/src/middleware/creditEnforcement.ts — replace requireCreditsForRun flat-cost logic with computeRunCost(tier, mode, addons). computeRunCost validates each requested addon against tier eligibility before pricing. Rejects unknown addons with 400. Tier-disallowed addon returns 403. Pre-flight check: if computed cost exceeds available balance, return 402 before any orchestrator work begins. req.creditChargeContext carries computed cost downstream.</w:t>
+      </w:r>
+    </w:p>
+    <w:p>
+      <w:pPr>
+        <w:pStyle w:val="BodyText"/>
+      </w:pPr>
+      <w:r>
         <w:rPr>
           <w:b/>
           <w:bCs/>
         </w:rPr>
-        <w:t>Files to create:</w:t>
-      </w:r>
-      <w:r>
-        <w:t xml:space="preserve"> </w:t>
-      </w:r>
-      <w:r>
-        <w:rPr>
-          <w:rStyle w:val="VerbatimChar"/>
-        </w:rPr>
-        <w:t>backend/src/middleware/creditEnforcement.ts</w:t>
-      </w:r>
-      <w:r>
-        <w:t xml:space="preserve"> — </w:t>
-      </w:r>
-      <w:r>
-        <w:rPr>
-          <w:rStyle w:val="VerbatimChar"/>
-        </w:rPr>
-        <w:t>requireCreditsForRun</w:t>
-      </w:r>
-      <w:r>
-        <w:t xml:space="preserve"> middleware (code in Section 12).</w:t>
-      </w:r>
-    </w:p>
-    <w:p>
-      <w:pPr>
-        <w:pStyle w:val="BodyText"/>
-      </w:pPr>
-      <w:r>
-        <w:rPr>
-          <w:b/>
-          <w:bCs/>
-        </w:rPr>
         <w:t>Files to modify:</w:t>
       </w:r>
     </w:p>
@@ -57654,14 +57649,7 @@
         <w:pStyle w:val="BodyText"/>
       </w:pPr>
       <w:r>
-        <w:rPr>
-          <w:b/>
-          <w:bCs/>
-        </w:rPr>
-        <w:t>Acceptance criteria:</w:t>
-      </w:r>
-      <w:r>
-        <w:t xml:space="preserve"> - Pro user with subscription quota remaining starts run → quota decrements only on successful completion - Wallet user with $10 starts $4 Standard run → run completes → wallet shows $6 with ledger row - Wallet user with $10 starts $4 Standard run → run fails → wallet still $10, no ledger row - BYOK user starts run → no platform credit charge regardless of outcome - Wallet user with $0 starts run → 402 returned, no orchestrator work begins - Concurrent run attempts: user with $10 starts two $4 runs simultaneously → second attempt either queues or returns 402 (race-safe)</w:t>
+        <w:t>Acceptance criteria: - computeRunCost(tier, mode, addons) returns correct total for each addon combination - Unknown addon returns 400 - Tier-disallowed addon returns 403 (not 200 with silent ignore) - Pro user with subscription quota remaining starts run → quota decrements only on successful completion - Wallet user with $10 starts $4 Standard run → run completes → wallet shows $6 with ledger row - Wallet user with $3 attempts $4 Standard run → 402, run never starts</w:t>
       </w:r>
     </w:p>
     <w:p>
@@ -57669,23 +57657,7 @@
         <w:pStyle w:val="BodyText"/>
       </w:pPr>
       <w:r>
-        <w:rPr>
-          <w:b/>
-          <w:bCs/>
-        </w:rPr>
-        <w:t>Tests required (must fail without the fix):</w:t>
-      </w:r>
-      <w:r>
-        <w:t xml:space="preserve"> Successful run debits correctly. Failed run does not debit. Insufficient balance returns 402 before any orchestrator work. Concurrent decrement race-safe (use </w:t>
-      </w:r>
-      <w:r>
-        <w:rPr>
-          <w:rStyle w:val="VerbatimChar"/>
-        </w:rPr>
-        <w:t>UPDATE ... WHERE balance_cents &gt;= $1 RETURNING ...</w:t>
-      </w:r>
-      <w:r>
-        <w:t>).</w:t>
+        <w:t>Tests required (must fail without the fix): each addon adds correct cost to computeRunCost output; tier-disallowed addon returns 403; unknown addon returns 400; successful run debits correctly; failed run does not debit; insufficient balance returns 402 before any orchestrator work; concurrent decrement race-safe (use UPDATE ... WHERE balance_cents &gt;= $1 RETURNING).</w:t>
       </w:r>
     </w:p>
     <w:p>
@@ -57744,119 +57716,7 @@
         <w:pStyle w:val="BodyText"/>
       </w:pPr>
       <w:r>
-        <w:rPr>
-          <w:b/>
-          <w:bCs/>
-        </w:rPr>
-        <w:t>Files to create:</w:t>
-      </w:r>
-      <w:r>
-        <w:t xml:space="preserve"> - Migration </w:t>
-      </w:r>
-      <w:r>
-        <w:rPr>
-          <w:rStyle w:val="VerbatimChar"/>
-        </w:rPr>
-        <w:t>20260XXX_byok_keys.sql</w:t>
-      </w:r>
-      <w:r>
-        <w:t xml:space="preserve"> (per Section 13) - </w:t>
-      </w:r>
-      <w:r>
-        <w:rPr>
-          <w:rStyle w:val="VerbatimChar"/>
-        </w:rPr>
-        <w:t>backend/src/services/byok/encryption.ts</w:t>
-      </w:r>
-      <w:r>
-        <w:t xml:space="preserve"> — AES-256-GCM helpers using </w:t>
-      </w:r>
-      <w:r>
-        <w:rPr>
-          <w:rStyle w:val="VerbatimChar"/>
-        </w:rPr>
-        <w:t>BYOK_ENCRYPTION_KEY</w:t>
-      </w:r>
-      <w:r>
-        <w:t xml:space="preserve"> env (32-byte master key) - </w:t>
-      </w:r>
-      <w:r>
-        <w:rPr>
-          <w:rStyle w:val="VerbatimChar"/>
-        </w:rPr>
-        <w:t>backend/src/services/byok/keyVault.ts</w:t>
-      </w:r>
-      <w:r>
-        <w:t xml:space="preserve"> — </w:t>
-      </w:r>
-      <w:r>
-        <w:rPr>
-          <w:rStyle w:val="VerbatimChar"/>
-        </w:rPr>
-        <w:t>storeKey</w:t>
-      </w:r>
-      <w:r>
-        <w:t xml:space="preserve">, </w:t>
-      </w:r>
-      <w:r>
-        <w:rPr>
-          <w:rStyle w:val="VerbatimChar"/>
-        </w:rPr>
-        <w:t>retrieveDecryptedKey</w:t>
-      </w:r>
-      <w:r>
-        <w:t xml:space="preserve">, </w:t>
-      </w:r>
-      <w:r>
-        <w:rPr>
-          <w:rStyle w:val="VerbatimChar"/>
-        </w:rPr>
-        <w:t>validateKey</w:t>
-      </w:r>
-      <w:r>
-        <w:t xml:space="preserve"> (calls OpenRouter </w:t>
-      </w:r>
-      <w:r>
-        <w:rPr>
-          <w:rStyle w:val="VerbatimChar"/>
-        </w:rPr>
-        <w:t>/api/v1/auth/key</w:t>
-      </w:r>
-      <w:r>
-        <w:t xml:space="preserve">), </w:t>
-      </w:r>
-      <w:r>
-        <w:rPr>
-          <w:rStyle w:val="VerbatimChar"/>
-        </w:rPr>
-        <w:t>deleteKey</w:t>
-      </w:r>
-      <w:r>
-        <w:t xml:space="preserve">, </w:t>
-      </w:r>
-      <w:r>
-        <w:rPr>
-          <w:rStyle w:val="VerbatimChar"/>
-        </w:rPr>
-        <w:t>getKeyStatus</w:t>
-      </w:r>
-      <w:r>
-        <w:t xml:space="preserve"> - </w:t>
-      </w:r>
-      <w:r>
-        <w:rPr>
-          <w:rStyle w:val="VerbatimChar"/>
-        </w:rPr>
-        <w:t>backend/src/api/byok/keys.ts</w:t>
-      </w:r>
-      <w:r>
-        <w:t xml:space="preserve"> — POST, GET status, DELETE - </w:t>
-      </w:r>
-      <w:r>
-        <w:rPr>
-          <w:rStyle w:val="VerbatimChar"/>
-        </w:rPr>
-        <w:t>frontend/src/pages/BYOKConfigPage.tsx</w:t>
+        <w:t>Files to create: - Migration 20260XXX_byok_keys.sql: add provider TEXT NOT NULL DEFAULT 'openrouter' column to byok_keys table; backfill existing rows to 'openrouter'; add CHECK constraint: provider IN ('openrouter', 'together', 'huggingface', 'anthropic', 'openai'). Composite primary key becomes (user_id, provider). - backend/src/services/byok/encryption.ts — AES-256-GCM helpers using BYOK_ENCRYPTION_KEY env (32-byte master key). - backend/src/services/byok/keyVault.ts — replace single-provider getter with getDecryptedKey(userId, provider): retrieves and decrypts the key for the given provider; storeKey(userId, provider, key); revokeKey(userId, provider).</w:t>
       </w:r>
     </w:p>
     <w:p>
@@ -59715,6 +59575,11 @@
       </w:r>
     </w:p>
     <w:p>
+      <w:r>
+        <w:t xml:space="preserve">Additional tables requiring RLS policies in 20260XXX_rls_policies.sql: report_monitors (user_id isolation), report_monitor_events (user_id isolation; append-only — REVOKE UPDATE, DELETE from application_role; no row may ever be mutated or removed), provenance_ledgers (user_id isolation), adversarial_twin_runs (user_id isolation), tier_addons (read-only to all application_role users; writes admin-only via separate admin_role).</w:t>
+      </w:r>
+    </w:p>
+    <w:p>
       <w:pPr>
         <w:pStyle w:val="SourceCode"/>
       </w:pPr>
@@ -60348,6 +60213,11 @@
       </w:r>
     </w:p>
     <w:p>
+      <w:r>
+        <w:t xml:space="preserve">Sanitization gate metadata-passthrough allowlist additions: scite_institutional_status, scite_supporting_count, scite_contrasting_count, scite_mentioning_count, scite_contrasting_paper_dois, scite_citation_section. PII gate confirmation required: verify that none of these fields contain or can be used to reconstruct user-identifying data before allowing passthrough. These fields describe external citation metadata about the source document, not about any ResearchOne user.</w:t>
+      </w:r>
+    </w:p>
+    <w:p>
       <w:pPr>
         <w:pStyle w:val="Compact"/>
         <w:numPr>
@@ -61380,6 +61250,41 @@
       </w:r>
     </w:p>
     <w:p>
+      <w:r>
+        <w:t xml:space="preserve">Section 7 doctrine additions — append to modeOverlays.ts and promptComposer.ts:</w:t>
+      </w:r>
+    </w:p>
+    <w:p>
+      <w:r>
+        <w:t xml:space="preserve">Stage 4 Retriever Analysis preamble addition (all modes): "Some chunks carry institutional-status metadata from external citation indices. Treat as one signal among many, not a verdict. A chunk marked retracted may have been retracted for fabricated data, or under political pressure, funding threats, or paradigm-defense. Evaluate the underlying mechanism — is the claim structurally sound — not the retraction status. If you cannot evaluate the mechanism without further investigation, mark for Skeptic scrutiny and surface as a contradiction-investigation lead. Never silently demote a chunk because it carries institutional friction."</w:t>
+      </w:r>
+    </w:p>
+    <w:p>
+      <w:r>
+        <w:t xml:space="preserve">Stage 6 Skeptic addition (all V2 modes): When a chunk's source has scite_contrasting_paper_dois, the orchestrator dispatches a bounded sub-discovery to pull contrasting papers into the run's corpus before Skeptic runs. Skeptic prompt addition: "A retracted or contrasted source is a puzzle, not a falsified claim. Reason structurally about whether the original mechanism and the contrasting paper's mechanism are compatible, incompatible, or addressing different conditions. Premature collapse to consensus is failure. Premature collapse to contrarianism is also failure. Output a structured comparison."</w:t>
+      </w:r>
+    </w:p>
+    <w:p>
+      <w:r>
+        <w:t xml:space="preserve">Stage 8 Verifier rule (inverted from naive auto-debunk): "If the report cites any source with institutional_status: retracted or high contrasting_count, the report MUST contain a structural-mechanism comparison section that names the retraction/contrast and reasons through it. Reports that cite contested sources without doing this analysis fail verification. Reports that cite contested sources AND reason through them pass verification regardless of the contested status."</w:t>
+      </w:r>
+    </w:p>
+    <w:p>
+      <w:r>
+        <w:t xml:space="preserve">Stage 10 Epistemic Persistence addition: Each Scite-flagged contrast becomes a row in the contradictions table with source_kind='scite_external'. Feeds the Contradiction Heatmap product.</w:t>
+      </w:r>
+    </w:p>
+    <w:p>
+      <w:r>
+        <w:t xml:space="preserve">Sixth mode — ADVERSARIAL_TWIN: Pipeline: Planner (skip — input doc IS the plan) → Discovery (skip — corpus is the input doc) → Retriever (skip) → Retriever Analysis (skip) → Reasoner (skip) → Skeptic (full attack) → Synthesizer (writes "contradictions and gaps" report only) → Verifier → Save → Persistence. Files to create: ADVERSARIAL_TWIN entry in backend/src/constants/modeOverlays.ts with Skeptic overlay (attack-an-existing-document prompt) and Synthesizer overlay (output contradictions and gaps section only, no new research). Files to modify: backend/src/services/reasoning/researchOrchestrator.ts — add ADVERSARIAL_TWIN branch that accepts an uploaded document as corpus input and skips pipeline stages 1–5.</w:t>
+      </w:r>
+    </w:p>
+    <w:p>
+      <w:r>
+        <w:t xml:space="preserve">Tests required for doctrine additions (must fail without the fix): (1) Retracted-source regression: input chunk with scite_institutional_status='retracted' reaches Reasoner with evidence_tier UNCHANGED — test fails if any code path auto-tiers to debunked. (2) Verifier accepts report citing retracted source IFF report contains mechanism-comparison section; rejects report citing retracted source without it. (3) Adversarial Twin run on a sample doc returns ONLY contradictions/gaps section, not new research content.</w:t>
+      </w:r>
+    </w:p>
+    <w:p>
       <w:pPr>
         <w:pStyle w:val="BodyText"/>
       </w:pPr>
@@ -61471,61 +61376,7 @@
         <w:pStyle w:val="BodyText"/>
       </w:pPr>
       <w:r>
-        <w:t xml:space="preserve">Frontend: </w:t>
-      </w:r>
-      <w:r>
-        <w:rPr>
-          <w:rStyle w:val="VerbatimChar"/>
-        </w:rPr>
-        <w:t>AdminDashboard.tsx</w:t>
-      </w:r>
-      <w:r>
-        <w:t xml:space="preserve">, </w:t>
-      </w:r>
-      <w:r>
-        <w:rPr>
-          <w:rStyle w:val="VerbatimChar"/>
-        </w:rPr>
-        <w:t>UserLookup.tsx</w:t>
-      </w:r>
-      <w:r>
-        <w:t xml:space="preserve">, </w:t>
-      </w:r>
-      <w:r>
-        <w:rPr>
-          <w:rStyle w:val="VerbatimChar"/>
-        </w:rPr>
-        <w:t>WalletAdjustment.tsx</w:t>
-      </w:r>
-      <w:r>
-        <w:t xml:space="preserve">, </w:t>
-      </w:r>
-      <w:r>
-        <w:rPr>
-          <w:rStyle w:val="VerbatimChar"/>
-        </w:rPr>
-        <w:t>TierOverride.tsx</w:t>
-      </w:r>
-      <w:r>
-        <w:t xml:space="preserve">, </w:t>
-      </w:r>
-      <w:r>
-        <w:rPr>
-          <w:rStyle w:val="VerbatimChar"/>
-        </w:rPr>
-        <w:t>RunTelemetry.tsx</w:t>
-      </w:r>
-      <w:r>
-        <w:t xml:space="preserve">, </w:t>
-      </w:r>
-      <w:r>
-        <w:rPr>
-          <w:rStyle w:val="VerbatimChar"/>
-        </w:rPr>
-        <w:t>AuditLogViewer.tsx</w:t>
-      </w:r>
-      <w:r>
-        <w:t>.</w:t>
+        <w:t>Frontend: AdminDashboard.tsx, UserLookup.tsx, WalletAdjustment.tsx, TierOverride.tsx, RunTelemetry.tsx, AuditLogViewer.tsx, MonitorsAdmin.tsx (org-level view of active Living Report monitors), AdversarialTwinQueue.tsx (queue of pending adversarial twin jobs), PolicyOneScoreApiKeys.tsx (API key management for PolicyOne Score API Pro), ContradictionHeatmap.tsx (org-level contradiction heatmap view).</w:t>
       </w:r>
     </w:p>
     <w:p>
@@ -61533,88 +61384,7 @@
         <w:pStyle w:val="BodyText"/>
       </w:pPr>
       <w:r>
-        <w:t xml:space="preserve">Backend: </w:t>
-      </w:r>
-      <w:r>
-        <w:rPr>
-          <w:rStyle w:val="VerbatimChar"/>
-        </w:rPr>
-        <w:t>api/admin/users.ts</w:t>
-      </w:r>
-      <w:r>
-        <w:t xml:space="preserve"> (search by email, GET by id), </w:t>
-      </w:r>
-      <w:r>
-        <w:rPr>
-          <w:rStyle w:val="VerbatimChar"/>
-        </w:rPr>
-        <w:t>wallet.ts</w:t>
-      </w:r>
-      <w:r>
-        <w:t xml:space="preserve"> (</w:t>
-      </w:r>
-      <w:r>
-        <w:rPr>
-          <w:rStyle w:val="VerbatimChar"/>
-        </w:rPr>
-        <w:t>POST /api/admin/users/:id/wallet-adjust</w:t>
-      </w:r>
-      <w:r>
-        <w:t xml:space="preserve"> with reason — logged as </w:t>
-      </w:r>
-      <w:r>
-        <w:rPr>
-          <w:rStyle w:val="VerbatimChar"/>
-        </w:rPr>
-        <w:t>admin_adjustment</w:t>
-      </w:r>
-      <w:r>
-        <w:t xml:space="preserve">), </w:t>
-      </w:r>
-      <w:r>
-        <w:rPr>
-          <w:rStyle w:val="VerbatimChar"/>
-        </w:rPr>
-        <w:t>tier.ts</w:t>
-      </w:r>
-      <w:r>
-        <w:t xml:space="preserve"> (</w:t>
-      </w:r>
-      <w:r>
-        <w:rPr>
-          <w:rStyle w:val="VerbatimChar"/>
-        </w:rPr>
-        <w:t>POST /api/admin/users/:id/tier-override</w:t>
-      </w:r>
-      <w:r>
-        <w:t xml:space="preserve"> with reason), </w:t>
-      </w:r>
-      <w:r>
-        <w:rPr>
-          <w:rStyle w:val="VerbatimChar"/>
-        </w:rPr>
-        <w:t>telemetry.ts</w:t>
-      </w:r>
-      <w:r>
-        <w:t xml:space="preserve"> (run statistics), </w:t>
-      </w:r>
-      <w:r>
-        <w:rPr>
-          <w:rStyle w:val="VerbatimChar"/>
-        </w:rPr>
-        <w:t>audit.ts</w:t>
-      </w:r>
-      <w:r>
-        <w:t xml:space="preserve"> (</w:t>
-      </w:r>
-      <w:r>
-        <w:rPr>
-          <w:rStyle w:val="VerbatimChar"/>
-        </w:rPr>
-        <w:t>GET /api/admin/audit-log</w:t>
-      </w:r>
-      <w:r>
-        <w:t xml:space="preserve"> with filters).</w:t>
+        <w:t>Backend: api/admin/users.ts (search by email, GET by id), wallet.ts (POST /api/admin/users/:id/wallet-adjust with reason — logged as admin_adjustment), tier.ts (POST /api/admin/users/:id/tier-override with reason), telemetry.ts (run statistics), audit.ts (audit log query). Additional admin endpoints: api/admin/monitors/ (list and manage Living Report monitor subscriptions), api/admin/twin/ (view and manage adversarial twin job queue), api/admin/policyone-api-keys/ (issue, revoke, and audit PolicyOne Score API Pro keys), api/admin/contradictions/ (query contradiction heatmap data across orgs).</w:t>
       </w:r>
     </w:p>
     <w:p>
@@ -61892,6 +61662,11 @@
       </w:r>
     </w:p>
     <w:p>
+      <w:r>
+        <w:t xml:space="preserve">Health endpoint additions: include parallel: { ok: boolean, latencyMs: number } and scite: { ok: boolean, latencyMs: number } in the checks object. Status is 'degraded' if either parallel or scite latency exceeds 2000 ms.</w:t>
+      </w:r>
+    </w:p>
+    <w:p>
       <w:pPr>
         <w:pStyle w:val="FirstParagraph"/>
       </w:pPr>
@@ -61972,34 +61747,12 @@
         <w:pStyle w:val="BodyText"/>
       </w:pPr>
       <w:r>
-        <w:t xml:space="preserve">Legal stubs: </w:t>
-      </w:r>
-      <w:r>
-        <w:rPr>
-          <w:rStyle w:val="VerbatimChar"/>
-        </w:rPr>
-        <w:t>TermsPage.tsx</w:t>
-      </w:r>
-      <w:r>
-        <w:t xml:space="preserve">, </w:t>
-      </w:r>
-      <w:r>
-        <w:rPr>
-          <w:rStyle w:val="VerbatimChar"/>
-        </w:rPr>
-        <w:t>PrivacyPage.tsx</w:t>
-      </w:r>
-      <w:r>
-        <w:t xml:space="preserve">, </w:t>
-      </w:r>
-      <w:r>
-        <w:rPr>
-          <w:rStyle w:val="VerbatimChar"/>
-        </w:rPr>
-        <w:t>AcceptableUsePage.tsx</w:t>
-      </w:r>
-      <w:r>
-        <w:t>. Privacy Policy must explicitly disclose InTellMe ingestion.</w:t>
+        <w:t>Legal stubs: TermsPage.tsx, PrivacyPage.tsx, AcceptableUsePage.tsx. Privacy Policy must explicitly disclose InTellMe ingestion. Privacy Policy stub additions (legal review required): name Parallel Web Systems and Scite as data sub-processors; describe what data is sent to each; document user opt-out path for each sub-processor.</w:t>
+      </w:r>
+    </w:p>
+    <w:p>
+      <w:r>
+        <w:t xml:space="preserve">New service — Provenance Ledger: Files to create: backend/src/services/provenance/ledgerExporter.ts — generates tamper-evident PDF from research_runs + discovery_events + claims + contradictions + report_citations data with SHA-256 manifest signed by RESEARCHONE_LEDGER_SIGNING_KEY. Public verification endpoint: GET /api/provenance/verify/:manifestHash (validates manifest signature and completeness; no auth required).</w:t>
       </w:r>
     </w:p>
     <w:p>
@@ -62360,23 +62113,7 @@
         </w:numPr>
       </w:pPr>
       <w:r>
-        <w:rPr>
-          <w:b/>
-          <w:bCs/>
-        </w:rPr>
-        <w:t>Production environment variables.</w:t>
-      </w:r>
-      <w:r>
-        <w:t xml:space="preserve"> Provision all </w:t>
-      </w:r>
-      <w:r>
-        <w:rPr>
-          <w:rStyle w:val="VerbatimChar"/>
-        </w:rPr>
-        <w:t>.env</w:t>
-      </w:r>
-      <w:r>
-        <w:t xml:space="preserve"> values: real Clerk keys, Stripe keys, OpenRouter key, BYOK encryption key, InTellMe ingestion token, SheerID program ID. Document in secure password manager — never commit.</w:t>
+        <w:t>Production environment variables. Provision all .env values: real Clerk keys, Stripe keys, OpenRouter key, BYOK encryption key, InTellMe ingestion token, SheerID program ID. Document in secure password manager — never commit. Append to env provisioning checklist: PARALLEL_API_KEY, PARALLEL_MONITOR_WEBHOOK_SECRET, SCITE_API_KEY, OPENALEX_USER_AGENT, CROSSREF_USER_AGENT, RESEARCHONE_LEDGER_SIGNING_KEY (32-byte key for Provenance Ledger signing).</w:t>
       </w:r>
     </w:p>
     <w:p>
@@ -62501,14 +62238,7 @@
         </w:numPr>
       </w:pPr>
       <w:r>
-        <w:rPr>
-          <w:b/>
-          <w:bCs/>
-        </w:rPr>
-        <w:t>CSP headers.</w:t>
-      </w:r>
-      <w:r>
-        <w:t xml:space="preserve"> Set Content-Security-Policy via Helmet, allowing Clerk, Stripe, InTellMe origins explicitly.</w:t>
+        <w:t>CSP headers. Set Content-Security-Policy via Helmet, allowing Clerk, Stripe, InTellMe origins explicitly. CSP additions: api.parallel.ai, api.scite.ai.</w:t>
       </w:r>
     </w:p>
     <w:p>
@@ -62557,41 +62287,7 @@
         </w:numPr>
       </w:pPr>
       <w:r>
-        <w:rPr>
-          <w:b/>
-          <w:bCs/>
-        </w:rPr>
-        <w:t>DNS.</w:t>
-      </w:r>
-      <w:r>
-        <w:t xml:space="preserve"> </w:t>
-      </w:r>
-      <w:r>
-        <w:rPr>
-          <w:rStyle w:val="VerbatimChar"/>
-        </w:rPr>
-        <w:t>researchone.io</w:t>
-      </w:r>
-      <w:r>
-        <w:t xml:space="preserve">, </w:t>
-      </w:r>
-      <w:r>
-        <w:rPr>
-          <w:rStyle w:val="VerbatimChar"/>
-        </w:rPr>
-        <w:t>www.researchone.io</w:t>
-      </w:r>
-      <w:r>
-        <w:t xml:space="preserve"> → Vercel; </w:t>
-      </w:r>
-      <w:r>
-        <w:rPr>
-          <w:rStyle w:val="VerbatimChar"/>
-        </w:rPr>
-        <w:t>api.researchone.io</w:t>
-      </w:r>
-      <w:r>
-        <w:t xml:space="preserve"> → Emma runtime VM.</w:t>
+        <w:t>DNS. researchone.io, www.researchone.io → Vercel; api.researchone.io → Emma runtime VM. Confirm api.researchone.io/api/webhooks/parallel-monitor routes to Emma runtime VM (required for WO-T Parallel Monitor webhook).</w:t>
       </w:r>
     </w:p>
     <w:p>
@@ -62733,16 +62429,15 @@
         <w:pStyle w:val="BodyText"/>
       </w:pPr>
       <w:r>
-        <w:t xml:space="preserve">Specifically test: - New user signup → onboarding → wallet top-up → first Standard report → wallet decrement → report visible - Free demo runs 3 reports → 4th attempt blocked with upgrade path - Pro user subscribes → mode access granted → quota tracked correctly - Team owner adds members → Stripe seats updated → org members access shared corpus - BYOK user adds key → runs use their key (verify via OpenRouter dashboard) - User deletes report → report gone locally → InTellMe deletion job enqueued and completes - User opts out of Pipeline B → next run does not ingest - Sovereign deployment cannot reach InTellMe (network policy + stub throw) - Admin can comp user’s tier - Failed run does not charge user - 402 returns when wallet empty - Webhook idempotency: replay </w:t>
-      </w:r>
-      <w:r>
-        <w:rPr>
-          <w:rStyle w:val="VerbatimChar"/>
-        </w:rPr>
-        <w:t>checkout.session.completed</w:t>
-      </w:r>
-      <w:r>
-        <w:t>, verify single ledger row</w:t>
+        <w:t>Specifically test: - New user signup → onboarding → wallet top-up → first Standard report → wallet decrement → report visible - Free demo runs 3 reports → 4th attempt blocked with upgrade path - Pro user subscribes → mode access granted → quota tracks correctly - Webhook replay (same checkout.session.completed twice) → no duplicate balance credit.</w:t>
+      </w:r>
+    </w:p>
+    <w:p>
+      <w:pPr>
+        <w:pStyle w:val="BodyText"/>
+      </w:pPr>
+      <w:r>
+        <w:t xml:space="preserve">Append to Section 15 Smoke Tests — six additional scenarios required: (1) Subscribe to Living Report → Parallel webhook fires → revision pipeline runs → user sees revised report. (2) Run Adversarial Twin against uploaded doc → output contains only contradictions and gaps, not new research. (3) Provenance Ledger export → public verification endpoint validates manifest. (4) Retraction-handling regression: chunk with institutional_status='retracted' flows through pipeline without evidence_tier mutation. (5) Parallel webhook signature replay returns 200 idempotent (no duplicate revision). (6) Tier-disallowed addon returns 403, not 200 with silent ignore.</w:t>
       </w:r>
     </w:p>
     <w:p>

</xml_diff>